<commit_message>
cambios a lo que se tiene el figma
</commit_message>
<xml_diff>
--- a/public/docs/Formato de Artículo para Memorias del Congreso de Topografía.docx
+++ b/public/docs/Formato de Artículo para Memorias del Congreso de Topografía.docx
@@ -60,25 +60,7 @@
           <w:sz w:val="24"/>
           <w:szCs w:val="24"/>
         </w:rPr>
-        <w:t xml:space="preserve">centrado, mayúsculas, negrita, Times New </w:t>
-      </w:r>
-      <w:proofErr w:type="spellStart"/>
-      <w:r>
-        <w:rPr>
-          <w:rFonts w:ascii="Times New Roman" w:hAnsi="Times New Roman" w:cs="Times New Roman"/>
-          <w:sz w:val="24"/>
-          <w:szCs w:val="24"/>
-        </w:rPr>
-        <w:t>Roman</w:t>
-      </w:r>
-      <w:proofErr w:type="spellEnd"/>
-      <w:r>
-        <w:rPr>
-          <w:rFonts w:ascii="Times New Roman" w:hAnsi="Times New Roman" w:cs="Times New Roman"/>
-          <w:sz w:val="24"/>
-          <w:szCs w:val="24"/>
-        </w:rPr>
-        <w:t xml:space="preserve"> 14 pts.</w:t>
+        <w:t>centrado, mayúsculas, negrita, Times New Roman 14 pts.</w:t>
       </w:r>
       <w:r>
         <w:rPr>
@@ -173,62 +155,16 @@
           <w:sz w:val="24"/>
           <w:szCs w:val="24"/>
         </w:rPr>
-        <w:t xml:space="preserve"> la filiación principal de cada </w:t>
-      </w:r>
-      <w:proofErr w:type="gramStart"/>
-      <w:r>
-        <w:rPr>
-          <w:rFonts w:ascii="Times New Roman" w:hAnsi="Times New Roman" w:cs="Times New Roman"/>
-          <w:sz w:val="24"/>
-          <w:szCs w:val="24"/>
-        </w:rPr>
-        <w:t xml:space="preserve">autor </w:t>
-      </w:r>
-      <w:r>
-        <w:rPr>
-          <w:rFonts w:ascii="Times New Roman" w:hAnsi="Times New Roman" w:cs="Times New Roman"/>
-          <w:sz w:val="24"/>
-          <w:szCs w:val="24"/>
-        </w:rPr>
-        <w:t xml:space="preserve"> Times</w:t>
-      </w:r>
-      <w:proofErr w:type="gramEnd"/>
-      <w:r>
-        <w:rPr>
-          <w:rFonts w:ascii="Times New Roman" w:hAnsi="Times New Roman" w:cs="Times New Roman"/>
-          <w:sz w:val="24"/>
-          <w:szCs w:val="24"/>
-        </w:rPr>
-        <w:t xml:space="preserve"> New </w:t>
-      </w:r>
-      <w:proofErr w:type="spellStart"/>
-      <w:r>
-        <w:rPr>
-          <w:rFonts w:ascii="Times New Roman" w:hAnsi="Times New Roman" w:cs="Times New Roman"/>
-          <w:sz w:val="24"/>
-          <w:szCs w:val="24"/>
-        </w:rPr>
-        <w:t>Roman</w:t>
-      </w:r>
-      <w:proofErr w:type="spellEnd"/>
-      <w:r>
-        <w:rPr>
-          <w:rFonts w:ascii="Times New Roman" w:hAnsi="Times New Roman" w:cs="Times New Roman"/>
-          <w:sz w:val="24"/>
-          <w:szCs w:val="24"/>
-        </w:rPr>
-        <w:t xml:space="preserve"> 12 </w:t>
-      </w:r>
-      <w:proofErr w:type="spellStart"/>
-      <w:r>
-        <w:rPr>
-          <w:rFonts w:ascii="Times New Roman" w:hAnsi="Times New Roman" w:cs="Times New Roman"/>
-          <w:sz w:val="24"/>
-          <w:szCs w:val="24"/>
-        </w:rPr>
-        <w:t>pts</w:t>
-      </w:r>
-      <w:proofErr w:type="spellEnd"/>
+        <w:t xml:space="preserve"> la filiación principal de cada autor </w:t>
+      </w:r>
+      <w:r>
+        <w:rPr>
+          <w:rFonts w:ascii="Times New Roman" w:hAnsi="Times New Roman" w:cs="Times New Roman"/>
+          <w:sz w:val="24"/>
+          <w:szCs w:val="24"/>
+        </w:rPr>
+        <w:t xml:space="preserve"> Times New Roman 12 pts</w:t>
+      </w:r>
       <w:r>
         <w:rPr>
           <w:rFonts w:ascii="Times New Roman" w:hAnsi="Times New Roman" w:cs="Times New Roman"/>
@@ -266,43 +202,7 @@
           <w:sz w:val="24"/>
           <w:szCs w:val="24"/>
         </w:rPr>
-        <w:t xml:space="preserve">entre 150 y 250 palabras. Times New </w:t>
-      </w:r>
-      <w:proofErr w:type="spellStart"/>
-      <w:r>
-        <w:rPr>
-          <w:rFonts w:ascii="Times New Roman" w:hAnsi="Times New Roman" w:cs="Times New Roman"/>
-          <w:sz w:val="24"/>
-          <w:szCs w:val="24"/>
-        </w:rPr>
-        <w:t>Roman</w:t>
-      </w:r>
-      <w:proofErr w:type="spellEnd"/>
-      <w:r>
-        <w:rPr>
-          <w:rFonts w:ascii="Times New Roman" w:hAnsi="Times New Roman" w:cs="Times New Roman"/>
-          <w:sz w:val="24"/>
-          <w:szCs w:val="24"/>
-        </w:rPr>
-        <w:t xml:space="preserve"> 10 </w:t>
-      </w:r>
-      <w:proofErr w:type="spellStart"/>
-      <w:r>
-        <w:rPr>
-          <w:rFonts w:ascii="Times New Roman" w:hAnsi="Times New Roman" w:cs="Times New Roman"/>
-          <w:sz w:val="24"/>
-          <w:szCs w:val="24"/>
-        </w:rPr>
-        <w:t>pts</w:t>
-      </w:r>
-      <w:proofErr w:type="spellEnd"/>
-      <w:r>
-        <w:rPr>
-          <w:rFonts w:ascii="Times New Roman" w:hAnsi="Times New Roman" w:cs="Times New Roman"/>
-          <w:sz w:val="24"/>
-          <w:szCs w:val="24"/>
-        </w:rPr>
-        <w:t>, justificado.</w:t>
+        <w:t>entre 150 y 250 palabras. Times New Roman 10 pts, justificado.</w:t>
       </w:r>
     </w:p>
     <w:p>
@@ -627,103 +527,39 @@
           <w:sz w:val="24"/>
           <w:szCs w:val="24"/>
         </w:rPr>
-        <w:t xml:space="preserve">Sintetizar los principales hallazgos del estudio en función de los objetivos planteados. </w:t>
-      </w:r>
-      <w:proofErr w:type="gramStart"/>
-      <w:r>
-        <w:rPr>
-          <w:rFonts w:ascii="Times New Roman" w:hAnsi="Times New Roman" w:cs="Times New Roman"/>
-          <w:color w:val="EE0000"/>
-          <w:sz w:val="24"/>
-          <w:szCs w:val="24"/>
-        </w:rPr>
-        <w:t>Destacar</w:t>
-      </w:r>
-      <w:proofErr w:type="gramEnd"/>
-      <w:r>
-        <w:rPr>
-          <w:rFonts w:ascii="Times New Roman" w:hAnsi="Times New Roman" w:cs="Times New Roman"/>
-          <w:color w:val="EE0000"/>
-          <w:sz w:val="24"/>
-          <w:szCs w:val="24"/>
-        </w:rPr>
-        <w:t xml:space="preserve"> la coherencia de los resultados con el estado del arte. Reconocer las principales limitaciones de la investigación y señalar posibles líneas futuras de estudio.</w:t>
-      </w:r>
-    </w:p>
-    <w:p>
-      <w:pPr>
-        <w:rPr>
-          <w:rFonts w:ascii="Times New Roman" w:hAnsi="Times New Roman" w:cs="Times New Roman"/>
-          <w:b/>
-          <w:bCs/>
-          <w:sz w:val="24"/>
-          <w:szCs w:val="24"/>
-        </w:rPr>
-      </w:pPr>
-    </w:p>
-    <w:p>
-      <w:pPr>
-        <w:rPr>
-          <w:rFonts w:ascii="Times New Roman" w:hAnsi="Times New Roman" w:cs="Times New Roman"/>
-          <w:b/>
-          <w:bCs/>
-          <w:sz w:val="24"/>
-          <w:szCs w:val="24"/>
-        </w:rPr>
-      </w:pPr>
-      <w:r>
-        <w:rPr>
-          <w:rFonts w:ascii="Times New Roman" w:hAnsi="Times New Roman" w:cs="Times New Roman"/>
-          <w:b/>
-          <w:bCs/>
-          <w:sz w:val="24"/>
-          <w:szCs w:val="24"/>
-        </w:rPr>
-        <w:t xml:space="preserve">Formato general: Times New </w:t>
-      </w:r>
-      <w:proofErr w:type="spellStart"/>
-      <w:r>
-        <w:rPr>
-          <w:rFonts w:ascii="Times New Roman" w:hAnsi="Times New Roman" w:cs="Times New Roman"/>
-          <w:b/>
-          <w:bCs/>
-          <w:sz w:val="24"/>
-          <w:szCs w:val="24"/>
-        </w:rPr>
-        <w:t>Roman</w:t>
-      </w:r>
-      <w:proofErr w:type="spellEnd"/>
-      <w:r>
-        <w:rPr>
-          <w:rFonts w:ascii="Times New Roman" w:hAnsi="Times New Roman" w:cs="Times New Roman"/>
-          <w:b/>
-          <w:bCs/>
-          <w:sz w:val="24"/>
-          <w:szCs w:val="24"/>
-        </w:rPr>
-        <w:t xml:space="preserve"> 12 </w:t>
-      </w:r>
-      <w:proofErr w:type="spellStart"/>
-      <w:r>
-        <w:rPr>
-          <w:rFonts w:ascii="Times New Roman" w:hAnsi="Times New Roman" w:cs="Times New Roman"/>
-          <w:b/>
-          <w:bCs/>
-          <w:sz w:val="24"/>
-          <w:szCs w:val="24"/>
-        </w:rPr>
-        <w:t>pts</w:t>
-      </w:r>
-      <w:proofErr w:type="spellEnd"/>
-      <w:r>
-        <w:rPr>
-          <w:rFonts w:ascii="Times New Roman" w:hAnsi="Times New Roman" w:cs="Times New Roman"/>
-          <w:b/>
-          <w:bCs/>
-          <w:sz w:val="24"/>
-          <w:szCs w:val="24"/>
-        </w:rPr>
-        <w:t>, interlineado 1.5, texto justificado.</w:t>
+        <w:t>Sintetizar los principales hallazgos del estudio en función de los objetivos planteados. Destacar la coherencia de los resultados con el estado del arte. Reconocer las principales limitaciones de la investigación y señalar posibles líneas futuras de estudio.</w:t>
+      </w:r>
+    </w:p>
+    <w:p>
+      <w:pPr>
+        <w:rPr>
+          <w:rFonts w:ascii="Times New Roman" w:hAnsi="Times New Roman" w:cs="Times New Roman"/>
+          <w:b/>
+          <w:bCs/>
+          <w:sz w:val="24"/>
+          <w:szCs w:val="24"/>
+        </w:rPr>
+      </w:pPr>
+    </w:p>
+    <w:p>
+      <w:pPr>
+        <w:rPr>
+          <w:rFonts w:ascii="Times New Roman" w:hAnsi="Times New Roman" w:cs="Times New Roman"/>
+          <w:b/>
+          <w:bCs/>
+          <w:sz w:val="24"/>
+          <w:szCs w:val="24"/>
+        </w:rPr>
+      </w:pPr>
+      <w:r>
+        <w:rPr>
+          <w:rFonts w:ascii="Times New Roman" w:hAnsi="Times New Roman" w:cs="Times New Roman"/>
+          <w:b/>
+          <w:bCs/>
+          <w:sz w:val="24"/>
+          <w:szCs w:val="24"/>
+        </w:rPr>
+        <w:t>Formato general: Times New Roman 12 pts, interlineado 1.5, texto justificado.</w:t>
       </w:r>
     </w:p>
     <w:p>
@@ -884,21 +720,12 @@
         </w:rPr>
         <w:t xml:space="preserve">Congreso </w:t>
       </w:r>
-      <w:proofErr w:type="spellStart"/>
-      <w:r>
-        <w:rPr>
-          <w:b/>
-          <w:bCs/>
-        </w:rPr>
-        <w:t>Agrovet</w:t>
-      </w:r>
-      <w:proofErr w:type="spellEnd"/>
-      <w:r>
-        <w:rPr>
-          <w:b/>
-          <w:bCs/>
-        </w:rPr>
-        <w:t xml:space="preserve"> 2026</w:t>
+      <w:r>
+        <w:rPr>
+          <w:b/>
+          <w:bCs/>
+        </w:rPr>
+        <w:t>Digital Future2026</w:t>
       </w:r>
       <w:r>
         <w:t>, declaro de manera expresa que:</w:t>
@@ -1009,15 +836,13 @@
     </w:p>
     <w:p>
       <w:r>
-        <w:t xml:space="preserve">En fe de lo anterior, firmo la presente en la ciudad de ___________________, a los ____ días del mes de __________ </w:t>
-      </w:r>
-      <w:proofErr w:type="spellStart"/>
-      <w:r>
-        <w:t>de</w:t>
-      </w:r>
-      <w:proofErr w:type="spellEnd"/>
-      <w:r>
-        <w:t xml:space="preserve"> 2025.</w:t>
+        <w:t>En fe de lo anterior, firmo la presente en la ciudad de ___________________, a los ____ días del mes de __________ de 202</w:t>
+      </w:r>
+      <w:r>
+        <w:t>6</w:t>
+      </w:r>
+      <w:r>
+        <w:t>.</w:t>
       </w:r>
     </w:p>
     <w:p>
@@ -1083,7 +908,7 @@
       <w:headerReference w:type="default" r:id="rId7"/>
       <w:footerReference w:type="default" r:id="rId8"/>
       <w:pgSz w:w="11906" w:h="16838"/>
-      <w:pgMar w:top="1417" w:right="1701" w:bottom="1417" w:left="1701" w:header="708" w:footer="708" w:gutter="0"/>
+      <w:pgMar w:top="1417" w:right="1701" w:bottom="1417" w:left="1701" w:header="708" w:footer="0" w:gutter="0"/>
       <w:cols w:space="708"/>
       <w:docGrid w:linePitch="360"/>
     </w:sectPr>
@@ -1118,195 +943,79 @@
 
 <file path=word/footer1.xml><?xml version="1.0" encoding="utf-8"?>
 <w:ftr xmlns:wpc="http://schemas.microsoft.com/office/word/2010/wordprocessingCanvas" xmlns:cx="http://schemas.microsoft.com/office/drawing/2014/chartex" xmlns:cx1="http://schemas.microsoft.com/office/drawing/2015/9/8/chartex" xmlns:cx2="http://schemas.microsoft.com/office/drawing/2015/10/21/chartex" xmlns:cx3="http://schemas.microsoft.com/office/drawing/2016/5/9/chartex" xmlns:cx4="http://schemas.microsoft.com/office/drawing/2016/5/10/chartex" xmlns:cx5="http://schemas.microsoft.com/office/drawing/2016/5/11/chartex" xmlns:cx6="http://schemas.microsoft.com/office/drawing/2016/5/12/chartex" xmlns:cx7="http://schemas.microsoft.com/office/drawing/2016/5/13/chartex" xmlns:cx8="http://schemas.microsoft.com/office/drawing/2016/5/14/chartex" xmlns:mc="http://schemas.openxmlformats.org/markup-compatibility/2006" xmlns:aink="http://schemas.microsoft.com/office/drawing/2016/ink" xmlns:am3d="http://schemas.microsoft.com/office/drawing/2017/model3d" xmlns:o="urn:schemas-microsoft-com:office:office" xmlns:oel="http://schemas.microsoft.com/office/2019/extlst" xmlns:r="http://schemas.openxmlformats.org/officeDocument/2006/relationships" xmlns:m="http://schemas.openxmlformats.org/officeDocument/2006/math" xmlns:v="urn:schemas-microsoft-com:vml" xmlns:wp14="http://schemas.microsoft.com/office/word/2010/wordprocessingDrawing" xmlns:wp="http://schemas.openxmlformats.org/drawingml/2006/wordprocessingDrawing" xmlns:w10="urn:schemas-microsoft-com:office:word" xmlns:w="http://schemas.openxmlformats.org/wordprocessingml/2006/main" xmlns:w14="http://schemas.microsoft.com/office/word/2010/wordml" xmlns:w15="http://schemas.microsoft.com/office/word/2012/wordml" xmlns:w16cex="http://schemas.microsoft.com/office/word/2018/wordml/cex" xmlns:w16cid="http://schemas.microsoft.com/office/word/2016/wordml/cid" xmlns:w16="http://schemas.microsoft.com/office/word/2018/wordml" xmlns:w16du="http://schemas.microsoft.com/office/word/2023/wordml/word16du" xmlns:w16sdtdh="http://schemas.microsoft.com/office/word/2020/wordml/sdtdatahash" xmlns:w16sdtfl="http://schemas.microsoft.com/office/word/2024/wordml/sdtformatlock" xmlns:w16se="http://schemas.microsoft.com/office/word/2015/wordml/symex" xmlns:wpg="http://schemas.microsoft.com/office/word/2010/wordprocessingGroup" xmlns:wpi="http://schemas.microsoft.com/office/word/2010/wordprocessingInk" xmlns:wne="http://schemas.microsoft.com/office/word/2006/wordml" xmlns:wps="http://schemas.microsoft.com/office/word/2010/wordprocessingShape" mc:Ignorable="w14 w15 w16se w16cid w16 w16cex w16sdtdh w16sdtfl w16du wp14">
-  <w:sdt>
-    <w:sdtPr>
-      <w:id w:val="328875421"/>
-      <w:docPartObj>
-        <w:docPartGallery w:val="Page Numbers (Bottom of Page)"/>
-        <w:docPartUnique/>
-      </w:docPartObj>
-    </w:sdtPr>
-    <w:sdtContent>
-      <w:sdt>
-        <w:sdtPr>
-          <w:id w:val="-1769616900"/>
-          <w:docPartObj>
-            <w:docPartGallery w:val="Page Numbers (Top of Page)"/>
-            <w:docPartUnique/>
-          </w:docPartObj>
-        </w:sdtPr>
-        <w:sdtContent>
-          <w:p>
-            <w:pPr>
-              <w:pStyle w:val="Piedepgina"/>
-              <w:jc w:val="right"/>
-            </w:pPr>
-            <w:r>
-              <w:rPr>
-                <w:noProof/>
-                <w:lang w:val="es-ES"/>
-              </w:rPr>
-              <w:drawing>
-                <wp:anchor distT="0" distB="0" distL="114300" distR="114300" simplePos="0" relativeHeight="251658240" behindDoc="1" locked="0" layoutInCell="1" allowOverlap="1" wp14:anchorId="2185A3D5" wp14:editId="1A9084F2">
-                  <wp:simplePos x="0" y="0"/>
-                  <wp:positionH relativeFrom="page">
-                    <wp:posOffset>36558</wp:posOffset>
-                  </wp:positionH>
-                  <wp:positionV relativeFrom="page">
-                    <wp:posOffset>9791700</wp:posOffset>
-                  </wp:positionV>
-                  <wp:extent cx="7490444" cy="54610"/>
-                  <wp:effectExtent l="0" t="0" r="0" b="2540"/>
-                  <wp:wrapNone/>
-                  <wp:docPr id="303359130" name="Imagen 1"/>
-                  <wp:cNvGraphicFramePr>
-                    <a:graphicFrameLocks xmlns:a="http://schemas.openxmlformats.org/drawingml/2006/main" noChangeAspect="1"/>
-                  </wp:cNvGraphicFramePr>
-                  <a:graphic xmlns:a="http://schemas.openxmlformats.org/drawingml/2006/main">
-                    <a:graphicData uri="http://schemas.openxmlformats.org/drawingml/2006/picture">
-                      <pic:pic xmlns:pic="http://schemas.openxmlformats.org/drawingml/2006/picture">
-                        <pic:nvPicPr>
-                          <pic:cNvPr id="0" name="_x00000"/>
-                          <pic:cNvPicPr>
-                            <a:picLocks noChangeAspect="1" noChangeArrowheads="1"/>
-                          </pic:cNvPicPr>
-                        </pic:nvPicPr>
-                        <pic:blipFill>
-                          <a:blip r:embed="rId1">
-                            <a:extLst>
-                              <a:ext uri="{28A0092B-C50C-407E-A947-70E740481C1C}">
-                                <a14:useLocalDpi xmlns:a14="http://schemas.microsoft.com/office/drawing/2010/main" val="0"/>
-                              </a:ext>
-                            </a:extLst>
-                          </a:blip>
-                          <a:srcRect/>
-                          <a:stretch>
-                            <a:fillRect/>
-                          </a:stretch>
-                        </pic:blipFill>
-                        <pic:spPr bwMode="auto">
-                          <a:xfrm>
-                            <a:off x="0" y="0"/>
-                            <a:ext cx="7490444" cy="54610"/>
-                          </a:xfrm>
-                          <a:prstGeom prst="rect">
-                            <a:avLst/>
-                          </a:prstGeom>
-                          <a:noFill/>
-                        </pic:spPr>
-                      </pic:pic>
-                    </a:graphicData>
-                  </a:graphic>
-                  <wp14:sizeRelH relativeFrom="page">
-                    <wp14:pctWidth>0</wp14:pctWidth>
-                  </wp14:sizeRelH>
-                  <wp14:sizeRelV relativeFrom="page">
-                    <wp14:pctHeight>0</wp14:pctHeight>
-                  </wp14:sizeRelV>
-                </wp:anchor>
-              </w:drawing>
-            </w:r>
-            <w:r>
-              <w:rPr>
-                <w:lang w:val="es-ES"/>
-              </w:rPr>
-              <w:t xml:space="preserve">Página </w:t>
-            </w:r>
-            <w:r>
-              <w:rPr>
-                <w:b/>
-                <w:bCs/>
-                <w:sz w:val="24"/>
-                <w:szCs w:val="24"/>
-              </w:rPr>
-              <w:fldChar w:fldCharType="begin"/>
-            </w:r>
-            <w:r>
-              <w:rPr>
-                <w:b/>
-                <w:bCs/>
-              </w:rPr>
-              <w:instrText>PAGE</w:instrText>
-            </w:r>
-            <w:r>
-              <w:rPr>
-                <w:b/>
-                <w:bCs/>
-                <w:sz w:val="24"/>
-                <w:szCs w:val="24"/>
-              </w:rPr>
-              <w:fldChar w:fldCharType="separate"/>
-            </w:r>
-            <w:r>
-              <w:rPr>
-                <w:b/>
-                <w:bCs/>
-                <w:lang w:val="es-ES"/>
-              </w:rPr>
-              <w:t>2</w:t>
-            </w:r>
-            <w:r>
-              <w:rPr>
-                <w:b/>
-                <w:bCs/>
-                <w:sz w:val="24"/>
-                <w:szCs w:val="24"/>
-              </w:rPr>
-              <w:fldChar w:fldCharType="end"/>
-            </w:r>
-            <w:r>
-              <w:rPr>
-                <w:lang w:val="es-ES"/>
-              </w:rPr>
-              <w:t xml:space="preserve"> de </w:t>
-            </w:r>
-            <w:r>
-              <w:rPr>
-                <w:b/>
-                <w:bCs/>
-                <w:sz w:val="24"/>
-                <w:szCs w:val="24"/>
-              </w:rPr>
-              <w:fldChar w:fldCharType="begin"/>
-            </w:r>
-            <w:r>
-              <w:rPr>
-                <w:b/>
-                <w:bCs/>
-              </w:rPr>
-              <w:instrText>NUMPAGES</w:instrText>
-            </w:r>
-            <w:r>
-              <w:rPr>
-                <w:b/>
-                <w:bCs/>
-                <w:sz w:val="24"/>
-                <w:szCs w:val="24"/>
-              </w:rPr>
-              <w:fldChar w:fldCharType="separate"/>
-            </w:r>
-            <w:r>
-              <w:rPr>
-                <w:b/>
-                <w:bCs/>
-                <w:lang w:val="es-ES"/>
-              </w:rPr>
-              <w:t>2</w:t>
-            </w:r>
-            <w:r>
-              <w:rPr>
-                <w:b/>
-                <w:bCs/>
-                <w:sz w:val="24"/>
-                <w:szCs w:val="24"/>
-              </w:rPr>
-              <w:fldChar w:fldCharType="end"/>
-            </w:r>
-          </w:p>
-        </w:sdtContent>
-      </w:sdt>
-    </w:sdtContent>
-  </w:sdt>
+  <w:p>
+    <w:pPr>
+      <w:pStyle w:val="Piedepgina"/>
+      <w:jc w:val="right"/>
+    </w:pPr>
+    <w:r>
+      <w:rPr>
+        <w:noProof/>
+      </w:rPr>
+      <w:drawing>
+        <wp:anchor distT="0" distB="0" distL="114300" distR="114300" simplePos="0" relativeHeight="251658240" behindDoc="0" locked="0" layoutInCell="1" allowOverlap="1" wp14:anchorId="3FB3A26B" wp14:editId="64AE4F46">
+          <wp:simplePos x="0" y="0"/>
+          <wp:positionH relativeFrom="page">
+            <wp:posOffset>7620</wp:posOffset>
+          </wp:positionH>
+          <wp:positionV relativeFrom="paragraph">
+            <wp:posOffset>-449381</wp:posOffset>
+          </wp:positionV>
+          <wp:extent cx="7536180" cy="996080"/>
+          <wp:effectExtent l="0" t="0" r="0" b="0"/>
+          <wp:wrapSquare wrapText="bothSides"/>
+          <wp:docPr id="1092760603" name="Imagen 1"/>
+          <wp:cNvGraphicFramePr>
+            <a:graphicFrameLocks xmlns:a="http://schemas.openxmlformats.org/drawingml/2006/main" noChangeAspect="1"/>
+          </wp:cNvGraphicFramePr>
+          <a:graphic xmlns:a="http://schemas.openxmlformats.org/drawingml/2006/main">
+            <a:graphicData uri="http://schemas.openxmlformats.org/drawingml/2006/picture">
+              <pic:pic xmlns:pic="http://schemas.openxmlformats.org/drawingml/2006/picture">
+                <pic:nvPicPr>
+                  <pic:cNvPr id="0" name="Picture 2"/>
+                  <pic:cNvPicPr>
+                    <a:picLocks noChangeAspect="1" noChangeArrowheads="1"/>
+                  </pic:cNvPicPr>
+                </pic:nvPicPr>
+                <pic:blipFill>
+                  <a:blip r:embed="rId1">
+                    <a:extLst>
+                      <a:ext uri="{28A0092B-C50C-407E-A947-70E740481C1C}">
+                        <a14:useLocalDpi xmlns:a14="http://schemas.microsoft.com/office/drawing/2010/main" val="0"/>
+                      </a:ext>
+                    </a:extLst>
+                  </a:blip>
+                  <a:srcRect/>
+                  <a:stretch>
+                    <a:fillRect/>
+                  </a:stretch>
+                </pic:blipFill>
+                <pic:spPr bwMode="auto">
+                  <a:xfrm>
+                    <a:off x="0" y="0"/>
+                    <a:ext cx="7545285" cy="997283"/>
+                  </a:xfrm>
+                  <a:prstGeom prst="rect">
+                    <a:avLst/>
+                  </a:prstGeom>
+                  <a:noFill/>
+                  <a:ln>
+                    <a:noFill/>
+                  </a:ln>
+                </pic:spPr>
+              </pic:pic>
+            </a:graphicData>
+          </a:graphic>
+          <wp14:sizeRelH relativeFrom="page">
+            <wp14:pctWidth>0</wp14:pctWidth>
+          </wp14:sizeRelH>
+          <wp14:sizeRelV relativeFrom="page">
+            <wp14:pctHeight>0</wp14:pctHeight>
+          </wp14:sizeRelV>
+        </wp:anchor>
+      </w:drawing>
+    </w:r>
+  </w:p>
   <w:p>
     <w:pPr>
       <w:pStyle w:val="Piedepgina"/>
@@ -1342,491 +1051,77 @@
 
 <file path=word/header1.xml><?xml version="1.0" encoding="utf-8"?>
 <w:hdr xmlns:wpc="http://schemas.microsoft.com/office/word/2010/wordprocessingCanvas" xmlns:cx="http://schemas.microsoft.com/office/drawing/2014/chartex" xmlns:cx1="http://schemas.microsoft.com/office/drawing/2015/9/8/chartex" xmlns:cx2="http://schemas.microsoft.com/office/drawing/2015/10/21/chartex" xmlns:cx3="http://schemas.microsoft.com/office/drawing/2016/5/9/chartex" xmlns:cx4="http://schemas.microsoft.com/office/drawing/2016/5/10/chartex" xmlns:cx5="http://schemas.microsoft.com/office/drawing/2016/5/11/chartex" xmlns:cx6="http://schemas.microsoft.com/office/drawing/2016/5/12/chartex" xmlns:cx7="http://schemas.microsoft.com/office/drawing/2016/5/13/chartex" xmlns:cx8="http://schemas.microsoft.com/office/drawing/2016/5/14/chartex" xmlns:mc="http://schemas.openxmlformats.org/markup-compatibility/2006" xmlns:aink="http://schemas.microsoft.com/office/drawing/2016/ink" xmlns:am3d="http://schemas.microsoft.com/office/drawing/2017/model3d" xmlns:o="urn:schemas-microsoft-com:office:office" xmlns:oel="http://schemas.microsoft.com/office/2019/extlst" xmlns:r="http://schemas.openxmlformats.org/officeDocument/2006/relationships" xmlns:m="http://schemas.openxmlformats.org/officeDocument/2006/math" xmlns:v="urn:schemas-microsoft-com:vml" xmlns:wp14="http://schemas.microsoft.com/office/word/2010/wordprocessingDrawing" xmlns:wp="http://schemas.openxmlformats.org/drawingml/2006/wordprocessingDrawing" xmlns:w10="urn:schemas-microsoft-com:office:word" xmlns:w="http://schemas.openxmlformats.org/wordprocessingml/2006/main" xmlns:w14="http://schemas.microsoft.com/office/word/2010/wordml" xmlns:w15="http://schemas.microsoft.com/office/word/2012/wordml" xmlns:w16cex="http://schemas.microsoft.com/office/word/2018/wordml/cex" xmlns:w16cid="http://schemas.microsoft.com/office/word/2016/wordml/cid" xmlns:w16="http://schemas.microsoft.com/office/word/2018/wordml" xmlns:w16du="http://schemas.microsoft.com/office/word/2023/wordml/word16du" xmlns:w16sdtdh="http://schemas.microsoft.com/office/word/2020/wordml/sdtdatahash" xmlns:w16sdtfl="http://schemas.microsoft.com/office/word/2024/wordml/sdtformatlock" xmlns:w16se="http://schemas.microsoft.com/office/word/2015/wordml/symex" xmlns:wpg="http://schemas.microsoft.com/office/word/2010/wordprocessingGroup" xmlns:wpi="http://schemas.microsoft.com/office/word/2010/wordprocessingInk" xmlns:wne="http://schemas.microsoft.com/office/word/2006/wordml" xmlns:wps="http://schemas.microsoft.com/office/word/2010/wordprocessingShape" mc:Ignorable="w14 w15 w16se w16cid w16 w16cex w16sdtdh w16sdtfl w16du wp14">
-  <w:tbl>
-    <w:tblPr>
-      <w:tblW w:w="8493" w:type="dxa"/>
-      <w:jc w:val="center"/>
-      <w:tblBorders>
-        <w:top w:val="single" w:sz="8" w:space="0" w:color="000000"/>
-        <w:left w:val="single" w:sz="8" w:space="0" w:color="000000"/>
-        <w:bottom w:val="single" w:sz="8" w:space="0" w:color="000000"/>
-        <w:right w:val="single" w:sz="8" w:space="0" w:color="000000"/>
-        <w:insideH w:val="single" w:sz="8" w:space="0" w:color="000000"/>
-        <w:insideV w:val="single" w:sz="8" w:space="0" w:color="000000"/>
-      </w:tblBorders>
-      <w:tblLayout w:type="fixed"/>
-      <w:tblLook w:val="0400" w:firstRow="0" w:lastRow="0" w:firstColumn="0" w:lastColumn="0" w:noHBand="0" w:noVBand="1"/>
-    </w:tblPr>
-    <w:tblGrid>
-      <w:gridCol w:w="3396"/>
-      <w:gridCol w:w="3544"/>
-      <w:gridCol w:w="1553"/>
-    </w:tblGrid>
-    <w:tr>
-      <w:trPr>
-        <w:trHeight w:val="95"/>
-        <w:jc w:val="center"/>
-      </w:trPr>
-      <w:tc>
-        <w:tcPr>
-          <w:tcW w:w="3396" w:type="dxa"/>
-          <w:vMerge w:val="restart"/>
-          <w:tcBorders>
-            <w:top w:val="single" w:sz="8" w:space="0" w:color="000000" w:themeColor="text1"/>
-            <w:left w:val="single" w:sz="8" w:space="0" w:color="000000" w:themeColor="text1"/>
-            <w:right w:val="single" w:sz="8" w:space="0" w:color="000000" w:themeColor="text1"/>
-          </w:tcBorders>
-        </w:tcPr>
-        <w:p>
-          <w:pPr>
-            <w:spacing w:after="0" w:line="240" w:lineRule="auto"/>
-            <w:jc w:val="center"/>
-            <w:rPr>
-              <w:rFonts w:ascii="Arial" w:eastAsia="Arial" w:hAnsi="Arial" w:cs="Arial"/>
-            </w:rPr>
-          </w:pPr>
-          <w:r>
-            <w:rPr>
-              <w:rFonts w:ascii="Arial" w:eastAsia="Arial" w:hAnsi="Arial" w:cs="Arial"/>
-              <w:noProof/>
-            </w:rPr>
-            <w:drawing>
-              <wp:inline distT="0" distB="0" distL="0" distR="0" wp14:anchorId="16248C2B" wp14:editId="13221688">
-                <wp:extent cx="2010410" cy="854710"/>
-                <wp:effectExtent l="0" t="0" r="8890" b="2540"/>
-                <wp:docPr id="57692699" name="Imagen 1"/>
-                <wp:cNvGraphicFramePr>
-                  <a:graphicFrameLocks xmlns:a="http://schemas.openxmlformats.org/drawingml/2006/main" noChangeAspect="1"/>
-                </wp:cNvGraphicFramePr>
-                <a:graphic xmlns:a="http://schemas.openxmlformats.org/drawingml/2006/main">
-                  <a:graphicData uri="http://schemas.openxmlformats.org/drawingml/2006/picture">
-                    <pic:pic xmlns:pic="http://schemas.openxmlformats.org/drawingml/2006/picture">
-                      <pic:nvPicPr>
-                        <pic:cNvPr id="57692699" name=""/>
-                        <pic:cNvPicPr/>
-                      </pic:nvPicPr>
-                      <pic:blipFill>
-                        <a:blip r:embed="rId1"/>
-                        <a:stretch>
-                          <a:fillRect/>
-                        </a:stretch>
-                      </pic:blipFill>
-                      <pic:spPr>
-                        <a:xfrm>
-                          <a:off x="0" y="0"/>
-                          <a:ext cx="2010410" cy="854710"/>
-                        </a:xfrm>
-                        <a:prstGeom prst="rect">
-                          <a:avLst/>
-                        </a:prstGeom>
-                      </pic:spPr>
-                    </pic:pic>
-                  </a:graphicData>
-                </a:graphic>
-              </wp:inline>
-            </w:drawing>
-          </w:r>
-        </w:p>
-      </w:tc>
-      <w:tc>
-        <w:tcPr>
-          <w:tcW w:w="3544" w:type="dxa"/>
-          <w:tcBorders>
-            <w:top w:val="single" w:sz="8" w:space="0" w:color="000000" w:themeColor="text1"/>
-            <w:left w:val="single" w:sz="8" w:space="0" w:color="000000" w:themeColor="text1"/>
-            <w:bottom w:val="single" w:sz="8" w:space="0" w:color="000000" w:themeColor="text1"/>
-            <w:right w:val="single" w:sz="8" w:space="0" w:color="000000" w:themeColor="text1"/>
-          </w:tcBorders>
-          <w:tcMar>
-            <w:top w:w="0" w:type="dxa"/>
-            <w:left w:w="115" w:type="dxa"/>
-            <w:bottom w:w="0" w:type="dxa"/>
-            <w:right w:w="115" w:type="dxa"/>
-          </w:tcMar>
-          <w:vAlign w:val="center"/>
-        </w:tcPr>
-        <w:p>
-          <w:pPr>
-            <w:widowControl w:val="0"/>
-            <w:spacing w:after="0" w:line="240" w:lineRule="auto"/>
-            <w:jc w:val="center"/>
-            <w:rPr>
-              <w:rFonts w:ascii="Arial" w:eastAsia="Arial" w:hAnsi="Arial" w:cs="Arial"/>
-              <w:b/>
-              <w:sz w:val="18"/>
-              <w:szCs w:val="18"/>
-            </w:rPr>
-          </w:pPr>
-          <w:r>
-            <w:rPr>
-              <w:rFonts w:ascii="Arial" w:eastAsia="Arial" w:hAnsi="Arial" w:cs="Arial"/>
-              <w:b/>
-              <w:sz w:val="18"/>
-              <w:szCs w:val="18"/>
-            </w:rPr>
-            <w:t xml:space="preserve">Gestión de eventos Técnicos y </w:t>
-          </w:r>
-        </w:p>
-        <w:p>
-          <w:pPr>
-            <w:widowControl w:val="0"/>
-            <w:spacing w:after="0" w:line="240" w:lineRule="auto"/>
-            <w:jc w:val="center"/>
-            <w:rPr>
-              <w:rFonts w:ascii="Arial" w:eastAsia="Arial" w:hAnsi="Arial" w:cs="Arial"/>
-              <w:b/>
-              <w:sz w:val="18"/>
-              <w:szCs w:val="18"/>
-            </w:rPr>
-          </w:pPr>
-          <w:r>
-            <w:rPr>
-              <w:rFonts w:ascii="Arial" w:eastAsia="Arial" w:hAnsi="Arial" w:cs="Arial"/>
-              <w:b/>
-              <w:sz w:val="18"/>
-              <w:szCs w:val="18"/>
-            </w:rPr>
-            <w:t>Científicos</w:t>
-          </w:r>
-        </w:p>
-      </w:tc>
-      <w:tc>
-        <w:tcPr>
-          <w:tcW w:w="1553" w:type="dxa"/>
-          <w:tcBorders>
-            <w:top w:val="single" w:sz="8" w:space="0" w:color="000000" w:themeColor="text1"/>
-            <w:left w:val="single" w:sz="8" w:space="0" w:color="000000" w:themeColor="text1"/>
-            <w:bottom w:val="single" w:sz="8" w:space="0" w:color="000000" w:themeColor="text1"/>
-            <w:right w:val="single" w:sz="8" w:space="0" w:color="000000" w:themeColor="text1"/>
-          </w:tcBorders>
-          <w:tcMar>
-            <w:top w:w="0" w:type="dxa"/>
-            <w:left w:w="115" w:type="dxa"/>
-            <w:bottom w:w="0" w:type="dxa"/>
-            <w:right w:w="115" w:type="dxa"/>
-          </w:tcMar>
-          <w:vAlign w:val="center"/>
-        </w:tcPr>
-        <w:p>
-          <w:pPr>
-            <w:spacing w:after="0" w:line="240" w:lineRule="auto"/>
-            <w:jc w:val="center"/>
-            <w:rPr>
-              <w:rFonts w:ascii="Arial" w:eastAsia="Arial" w:hAnsi="Arial" w:cs="Arial"/>
-              <w:sz w:val="24"/>
-              <w:szCs w:val="24"/>
-            </w:rPr>
-          </w:pPr>
-          <w:r>
-            <w:rPr>
-              <w:rFonts w:ascii="Arial" w:eastAsia="Arial" w:hAnsi="Arial" w:cs="Arial"/>
-              <w:color w:val="000000"/>
-              <w:sz w:val="16"/>
-              <w:szCs w:val="16"/>
-            </w:rPr>
-            <w:t>VERSIÓN:</w:t>
-          </w:r>
-        </w:p>
-        <w:p>
-          <w:pPr>
-            <w:spacing w:after="0" w:line="240" w:lineRule="auto"/>
-            <w:jc w:val="center"/>
-            <w:rPr>
-              <w:rFonts w:ascii="Arial" w:eastAsia="Arial" w:hAnsi="Arial" w:cs="Arial"/>
-              <w:sz w:val="24"/>
-              <w:szCs w:val="24"/>
-            </w:rPr>
-          </w:pPr>
-          <w:r>
-            <w:rPr>
-              <w:rFonts w:ascii="Arial" w:eastAsia="Arial" w:hAnsi="Arial" w:cs="Arial"/>
-              <w:sz w:val="24"/>
-              <w:szCs w:val="24"/>
-            </w:rPr>
-            <w:t>002</w:t>
-          </w:r>
-        </w:p>
-      </w:tc>
-    </w:tr>
-    <w:tr>
-      <w:trPr>
-        <w:trHeight w:val="263"/>
-        <w:jc w:val="center"/>
-      </w:trPr>
-      <w:tc>
-        <w:tcPr>
-          <w:tcW w:w="3396" w:type="dxa"/>
-          <w:vMerge/>
-        </w:tcPr>
-        <w:p>
-          <w:pPr>
-            <w:widowControl w:val="0"/>
-            <w:pBdr>
-              <w:top w:val="nil"/>
-              <w:left w:val="nil"/>
-              <w:bottom w:val="nil"/>
-              <w:right w:val="nil"/>
-              <w:between w:val="nil"/>
-            </w:pBdr>
-            <w:spacing w:after="0" w:line="276" w:lineRule="auto"/>
-            <w:rPr>
-              <w:rFonts w:ascii="Arial" w:eastAsia="Arial" w:hAnsi="Arial" w:cs="Arial"/>
-              <w:sz w:val="24"/>
-              <w:szCs w:val="24"/>
-            </w:rPr>
-          </w:pPr>
-        </w:p>
-      </w:tc>
-      <w:tc>
-        <w:tcPr>
-          <w:tcW w:w="3544" w:type="dxa"/>
-          <w:vMerge w:val="restart"/>
-          <w:tcBorders>
-            <w:top w:val="single" w:sz="8" w:space="0" w:color="000000" w:themeColor="text1"/>
-            <w:left w:val="single" w:sz="8" w:space="0" w:color="000000" w:themeColor="text1"/>
-            <w:right w:val="single" w:sz="8" w:space="0" w:color="000000" w:themeColor="text1"/>
-          </w:tcBorders>
-          <w:tcMar>
-            <w:top w:w="0" w:type="dxa"/>
-            <w:left w:w="115" w:type="dxa"/>
-            <w:bottom w:w="0" w:type="dxa"/>
-            <w:right w:w="115" w:type="dxa"/>
-          </w:tcMar>
-          <w:vAlign w:val="center"/>
-        </w:tcPr>
-        <w:p>
-          <w:pPr>
-            <w:spacing w:after="0" w:line="240" w:lineRule="auto"/>
-            <w:jc w:val="center"/>
-            <w:rPr>
-              <w:rFonts w:ascii="Arial" w:eastAsia="Arial" w:hAnsi="Arial" w:cs="Arial"/>
-              <w:b/>
-              <w:color w:val="000000"/>
-              <w:sz w:val="18"/>
-              <w:szCs w:val="18"/>
-            </w:rPr>
-          </w:pPr>
-          <w:r>
-            <w:rPr>
-              <w:rFonts w:ascii="Arial" w:eastAsia="Arial" w:hAnsi="Arial" w:cs="Arial"/>
-              <w:b/>
-              <w:color w:val="000000"/>
-              <w:sz w:val="18"/>
-              <w:szCs w:val="18"/>
-            </w:rPr>
-            <w:t xml:space="preserve">Formato de </w:t>
-          </w:r>
-          <w:r>
-            <w:rPr>
-              <w:rFonts w:ascii="Arial" w:eastAsia="Arial" w:hAnsi="Arial" w:cs="Arial"/>
-              <w:b/>
-              <w:color w:val="000000"/>
-              <w:sz w:val="18"/>
-              <w:szCs w:val="18"/>
-            </w:rPr>
-            <w:t xml:space="preserve">Presentación de </w:t>
-          </w:r>
-          <w:r>
-            <w:rPr>
-              <w:rFonts w:ascii="Arial" w:eastAsia="Arial" w:hAnsi="Arial" w:cs="Arial"/>
-              <w:b/>
-              <w:color w:val="000000"/>
-              <w:sz w:val="18"/>
-              <w:szCs w:val="18"/>
-            </w:rPr>
-            <w:t>Ponencias</w:t>
-          </w:r>
-        </w:p>
-      </w:tc>
-      <w:tc>
-        <w:tcPr>
-          <w:tcW w:w="1553" w:type="dxa"/>
-          <w:tcBorders>
-            <w:top w:val="single" w:sz="8" w:space="0" w:color="000000" w:themeColor="text1"/>
-            <w:left w:val="single" w:sz="8" w:space="0" w:color="000000" w:themeColor="text1"/>
-            <w:bottom w:val="single" w:sz="8" w:space="0" w:color="000000" w:themeColor="text1"/>
-            <w:right w:val="single" w:sz="8" w:space="0" w:color="000000" w:themeColor="text1"/>
-          </w:tcBorders>
-          <w:vAlign w:val="center"/>
-        </w:tcPr>
-        <w:p>
-          <w:pPr>
-            <w:spacing w:after="0" w:line="240" w:lineRule="auto"/>
-            <w:jc w:val="center"/>
-            <w:rPr>
-              <w:rFonts w:ascii="Arial" w:eastAsia="Arial" w:hAnsi="Arial" w:cs="Arial"/>
-              <w:color w:val="000000"/>
-              <w:sz w:val="16"/>
-              <w:szCs w:val="16"/>
-            </w:rPr>
-          </w:pPr>
-          <w:r>
-            <w:rPr>
-              <w:rFonts w:ascii="Arial" w:eastAsia="Arial" w:hAnsi="Arial" w:cs="Arial"/>
-              <w:color w:val="000000"/>
-              <w:sz w:val="16"/>
-              <w:szCs w:val="16"/>
-            </w:rPr>
-            <w:t>CÓDIGO:</w:t>
-          </w:r>
-        </w:p>
-        <w:p>
-          <w:pPr>
-            <w:spacing w:after="0" w:line="240" w:lineRule="auto"/>
-            <w:jc w:val="center"/>
-            <w:rPr>
-              <w:rFonts w:ascii="Arial" w:eastAsia="Arial" w:hAnsi="Arial" w:cs="Arial"/>
-              <w:sz w:val="16"/>
-              <w:szCs w:val="16"/>
-            </w:rPr>
-          </w:pPr>
-          <w:r>
-            <w:rPr>
-              <w:rFonts w:ascii="Arial" w:eastAsia="Arial" w:hAnsi="Arial" w:cs="Arial"/>
-              <w:sz w:val="14"/>
-              <w:szCs w:val="14"/>
-            </w:rPr>
-            <w:t>ISTS-GIDIVS-06</w:t>
-          </w:r>
-          <w:r>
-            <w:rPr>
-              <w:rFonts w:ascii="Arial" w:eastAsia="Arial" w:hAnsi="Arial" w:cs="Arial"/>
-              <w:sz w:val="14"/>
-              <w:szCs w:val="14"/>
-            </w:rPr>
-            <w:t>-0</w:t>
-          </w:r>
-          <w:r>
-            <w:rPr>
-              <w:rFonts w:ascii="Arial" w:eastAsia="Arial" w:hAnsi="Arial" w:cs="Arial"/>
-              <w:sz w:val="14"/>
-              <w:szCs w:val="14"/>
-            </w:rPr>
-            <w:t>010</w:t>
-          </w:r>
-        </w:p>
-      </w:tc>
-    </w:tr>
-    <w:tr>
-      <w:trPr>
-        <w:trHeight w:val="226"/>
-        <w:jc w:val="center"/>
-      </w:trPr>
-      <w:tc>
-        <w:tcPr>
-          <w:tcW w:w="3396" w:type="dxa"/>
-          <w:vMerge/>
-        </w:tcPr>
-        <w:p>
-          <w:pPr>
-            <w:widowControl w:val="0"/>
-            <w:pBdr>
-              <w:top w:val="nil"/>
-              <w:left w:val="nil"/>
-              <w:bottom w:val="nil"/>
-              <w:right w:val="nil"/>
-              <w:between w:val="nil"/>
-            </w:pBdr>
-            <w:spacing w:after="0" w:line="276" w:lineRule="auto"/>
-            <w:rPr>
-              <w:rFonts w:ascii="Arial" w:eastAsia="Arial" w:hAnsi="Arial" w:cs="Arial"/>
-              <w:sz w:val="16"/>
-              <w:szCs w:val="16"/>
-            </w:rPr>
-          </w:pPr>
-        </w:p>
-      </w:tc>
-      <w:tc>
-        <w:tcPr>
-          <w:tcW w:w="3544" w:type="dxa"/>
-          <w:vMerge/>
-          <w:tcMar>
-            <w:top w:w="0" w:type="dxa"/>
-            <w:left w:w="115" w:type="dxa"/>
-            <w:bottom w:w="0" w:type="dxa"/>
-            <w:right w:w="115" w:type="dxa"/>
-          </w:tcMar>
-          <w:vAlign w:val="center"/>
-        </w:tcPr>
-        <w:p>
-          <w:pPr>
-            <w:widowControl w:val="0"/>
-            <w:pBdr>
-              <w:top w:val="nil"/>
-              <w:left w:val="nil"/>
-              <w:bottom w:val="nil"/>
-              <w:right w:val="nil"/>
-              <w:between w:val="nil"/>
-            </w:pBdr>
-            <w:spacing w:after="0" w:line="276" w:lineRule="auto"/>
-            <w:rPr>
-              <w:rFonts w:ascii="Arial" w:eastAsia="Arial" w:hAnsi="Arial" w:cs="Arial"/>
-              <w:sz w:val="16"/>
-              <w:szCs w:val="16"/>
-            </w:rPr>
-          </w:pPr>
-        </w:p>
-      </w:tc>
-      <w:tc>
-        <w:tcPr>
-          <w:tcW w:w="1553" w:type="dxa"/>
-          <w:tcBorders>
-            <w:top w:val="single" w:sz="8" w:space="0" w:color="000000" w:themeColor="text1"/>
-            <w:left w:val="single" w:sz="8" w:space="0" w:color="000000" w:themeColor="text1"/>
-            <w:bottom w:val="single" w:sz="8" w:space="0" w:color="000000" w:themeColor="text1"/>
-            <w:right w:val="single" w:sz="8" w:space="0" w:color="000000" w:themeColor="text1"/>
-          </w:tcBorders>
-          <w:vAlign w:val="center"/>
-        </w:tcPr>
-        <w:p>
-          <w:pPr>
-            <w:spacing w:after="0" w:line="240" w:lineRule="auto"/>
-            <w:jc w:val="center"/>
-            <w:rPr>
-              <w:rFonts w:ascii="Arial" w:eastAsia="Arial" w:hAnsi="Arial" w:cs="Arial"/>
-              <w:color w:val="000000"/>
-              <w:sz w:val="16"/>
-              <w:szCs w:val="16"/>
-            </w:rPr>
-          </w:pPr>
-          <w:r>
-            <w:rPr>
-              <w:rFonts w:ascii="Arial" w:eastAsia="Arial" w:hAnsi="Arial" w:cs="Arial"/>
-              <w:color w:val="000000"/>
-              <w:sz w:val="16"/>
-              <w:szCs w:val="16"/>
-            </w:rPr>
-            <w:t xml:space="preserve">FECHA: </w:t>
-          </w:r>
-        </w:p>
-        <w:p>
-          <w:pPr>
-            <w:spacing w:after="0" w:line="240" w:lineRule="auto"/>
-            <w:jc w:val="center"/>
-            <w:rPr>
-              <w:rFonts w:ascii="Arial" w:eastAsia="Arial" w:hAnsi="Arial" w:cs="Arial"/>
-              <w:color w:val="000000"/>
-              <w:sz w:val="16"/>
-              <w:szCs w:val="16"/>
-            </w:rPr>
-          </w:pPr>
-          <w:r>
-            <w:rPr>
-              <w:rFonts w:ascii="Arial" w:eastAsia="Arial" w:hAnsi="Arial" w:cs="Arial"/>
-              <w:color w:val="000000" w:themeColor="text1"/>
-              <w:sz w:val="16"/>
-              <w:szCs w:val="16"/>
-            </w:rPr>
-            <w:t>29/08/2025</w:t>
-          </w:r>
-        </w:p>
-      </w:tc>
-    </w:tr>
-  </w:tbl>
   <w:p>
     <w:pPr>
       <w:pStyle w:val="Encabezado"/>
     </w:pPr>
+    <w:r>
+      <w:rPr>
+        <w:noProof/>
+      </w:rPr>
+      <w:drawing>
+        <wp:anchor distT="0" distB="0" distL="114300" distR="114300" simplePos="0" relativeHeight="251659264" behindDoc="0" locked="0" layoutInCell="1" allowOverlap="1" wp14:anchorId="6398796D" wp14:editId="13758646">
+          <wp:simplePos x="0" y="0"/>
+          <wp:positionH relativeFrom="page">
+            <wp:align>right</wp:align>
+          </wp:positionH>
+          <wp:positionV relativeFrom="paragraph">
+            <wp:posOffset>-449580</wp:posOffset>
+          </wp:positionV>
+          <wp:extent cx="7782976" cy="1028700"/>
+          <wp:effectExtent l="0" t="0" r="8890" b="0"/>
+          <wp:wrapSquare wrapText="bothSides"/>
+          <wp:docPr id="1188287924" name="Imagen 2"/>
+          <wp:cNvGraphicFramePr>
+            <a:graphicFrameLocks xmlns:a="http://schemas.openxmlformats.org/drawingml/2006/main" noChangeAspect="1"/>
+          </wp:cNvGraphicFramePr>
+          <a:graphic xmlns:a="http://schemas.openxmlformats.org/drawingml/2006/main">
+            <a:graphicData uri="http://schemas.openxmlformats.org/drawingml/2006/picture">
+              <pic:pic xmlns:pic="http://schemas.openxmlformats.org/drawingml/2006/picture">
+                <pic:nvPicPr>
+                  <pic:cNvPr id="0" name="Picture 4"/>
+                  <pic:cNvPicPr>
+                    <a:picLocks noChangeAspect="1" noChangeArrowheads="1"/>
+                  </pic:cNvPicPr>
+                </pic:nvPicPr>
+                <pic:blipFill>
+                  <a:blip r:embed="rId1">
+                    <a:extLst>
+                      <a:ext uri="{28A0092B-C50C-407E-A947-70E740481C1C}">
+                        <a14:useLocalDpi xmlns:a14="http://schemas.microsoft.com/office/drawing/2010/main" val="0"/>
+                      </a:ext>
+                    </a:extLst>
+                  </a:blip>
+                  <a:srcRect/>
+                  <a:stretch>
+                    <a:fillRect/>
+                  </a:stretch>
+                </pic:blipFill>
+                <pic:spPr bwMode="auto">
+                  <a:xfrm>
+                    <a:off x="0" y="0"/>
+                    <a:ext cx="7782976" cy="1028700"/>
+                  </a:xfrm>
+                  <a:prstGeom prst="rect">
+                    <a:avLst/>
+                  </a:prstGeom>
+                  <a:noFill/>
+                  <a:ln>
+                    <a:noFill/>
+                  </a:ln>
+                </pic:spPr>
+              </pic:pic>
+            </a:graphicData>
+          </a:graphic>
+          <wp14:sizeRelH relativeFrom="page">
+            <wp14:pctWidth>0</wp14:pctWidth>
+          </wp14:sizeRelH>
+          <wp14:sizeRelV relativeFrom="page">
+            <wp14:pctHeight>0</wp14:pctHeight>
+          </wp14:sizeRelV>
+        </wp:anchor>
+      </w:drawing>
+    </w:r>
   </w:p>
 </w:hdr>
 </file>
@@ -2951,6 +2246,7 @@
   <w:style w:type="character" w:default="1" w:styleId="Fuentedeprrafopredeter">
     <w:name w:val="Default Paragraph Font"/>
     <w:uiPriority w:val="1"/>
+    <w:semiHidden/>
     <w:unhideWhenUsed/>
   </w:style>
   <w:style w:type="table" w:default="1" w:styleId="Tablanormal">

</xml_diff>